<commit_message>
Remove assignment guideline references
</commit_message>
<xml_diff>
--- a/documents/CS499_3-2_Enhancement_One_Narrative_Shaban_Ghaith.docx
+++ b/documents/CS499_3-2_Enhancement_One_Narrative_Shaban_Ghaith.docx
@@ -108,23 +108,6 @@
     <w:p>
       <w:r>
         <w:t xml:space="preserve">The main challenge was keeping the enhancement meaningful without turning a small contact service into a much larger application. I handled that by completing the improvements from my code-review plan first: cleaner responsibilities, durable storage, input checks and stronger tests. I did not add unrelated features that would make the code harder to explain. This process helped me see that software engineering is not only writing more code. It is making focused design decisions, proving the behavior with tests and being able to explain the reason for each decision to another developer or employer. </w:t>
-      </w:r>
-    </w:p>
-    <w:p>
-      <w:pPr>
-        <w:pStyle w:val="Heading1"/>
-      </w:pPr>
-      <w:r>
-        <w:t>References</w:t>
-      </w:r>
-    </w:p>
-    <w:p>
-      <w:pPr>
-        <w:spacing w:after="60"/>
-        <w:ind w:left="360" w:hanging="360"/>
-      </w:pPr>
-      <w:r>
-        <w:t>Southern New Hampshire University. (2026). CS 499 Milestone Two: Enhancement One: Software Design and Engineering [Course assignment guidelines].</w:t>
       </w:r>
     </w:p>
     <w:sectPr>

</xml_diff>